<commit_message>
Nomenclature, FDR analysis, Table 4 literature rebuild, and claim-validation script
</commit_message>
<xml_diff>
--- a/Outputs/Tables/T1.docx
+++ b/Outputs/Tables/T1.docx
@@ -1942,7 +1942,7 @@
                 <w:szCs w:val="21"/>
                 <w:color w:val="000000"/>
               </w:rPr>
-              <w:t xml:space="preserve">2006-2009</w:t>
+              <w:t xml:space="preserve">2006–2009</w:t>
             </w:r>
           </w:p>
         </w:tc>
@@ -2222,7 +2222,7 @@
                 <w:szCs w:val="21"/>
                 <w:color w:val="000000"/>
               </w:rPr>
-              <w:t xml:space="preserve">2010-2013</w:t>
+              <w:t xml:space="preserve">2010–2013</w:t>
             </w:r>
           </w:p>
         </w:tc>
@@ -2502,7 +2502,7 @@
                 <w:szCs w:val="21"/>
                 <w:color w:val="000000"/>
               </w:rPr>
-              <w:t xml:space="preserve">2014-2017</w:t>
+              <w:t xml:space="preserve">2014–2017</w:t>
             </w:r>
           </w:p>
         </w:tc>
@@ -2782,7 +2782,7 @@
                 <w:szCs w:val="21"/>
                 <w:color w:val="000000"/>
               </w:rPr>
-              <w:t xml:space="preserve">2018-2021</w:t>
+              <w:t xml:space="preserve">2018–2021</w:t>
             </w:r>
           </w:p>
         </w:tc>

</xml_diff>